<commit_message>
fix V7 artifact integrity and sklearn compatibility
</commit_message>
<xml_diff>
--- a/experiments/rba_user_learning_curve/reports/RBA_Model_Experiment_V7_TH.docx
+++ b/experiments/rba_user_learning_curve/reports/RBA_Model_Experiment_V7_TH.docx
@@ -693,7 +693,7 @@
       <w:r>
         <w:drawing>
           <wp:inline xmlns:a="http://schemas.openxmlformats.org/drawingml/2006/main" xmlns:pic="http://schemas.openxmlformats.org/drawingml/2006/picture">
-            <wp:extent cx="5989320" cy="3023454"/>
+            <wp:extent cx="5989320" cy="3031681"/>
             <wp:docPr id="1" name="Picture 1"/>
             <wp:cNvGraphicFramePr>
               <a:graphicFrameLocks noChangeAspect="1"/>
@@ -714,7 +714,7 @@
                   <pic:spPr>
                     <a:xfrm>
                       <a:off x="0" y="0"/>
-                      <a:ext cx="5989320" cy="3023454"/>
+                      <a:ext cx="5989320" cy="3031681"/>
                     </a:xfrm>
                     <a:prstGeom prst="rect"/>
                   </pic:spPr>
@@ -754,7 +754,7 @@
       <w:r>
         <w:drawing>
           <wp:inline xmlns:a="http://schemas.openxmlformats.org/drawingml/2006/main" xmlns:pic="http://schemas.openxmlformats.org/drawingml/2006/picture">
-            <wp:extent cx="5989320" cy="3021379"/>
+            <wp:extent cx="5989320" cy="3035795"/>
             <wp:docPr id="2" name="Picture 2"/>
             <wp:cNvGraphicFramePr>
               <a:graphicFrameLocks noChangeAspect="1"/>
@@ -775,7 +775,7 @@
                   <pic:spPr>
                     <a:xfrm>
                       <a:off x="0" y="0"/>
-                      <a:ext cx="5989320" cy="3021379"/>
+                      <a:ext cx="5989320" cy="3035795"/>
                     </a:xfrm>
                     <a:prstGeom prst="rect"/>
                   </pic:spPr>
@@ -815,7 +815,7 @@
       <w:r>
         <w:drawing>
           <wp:inline xmlns:a="http://schemas.openxmlformats.org/drawingml/2006/main" xmlns:pic="http://schemas.openxmlformats.org/drawingml/2006/picture">
-            <wp:extent cx="5989320" cy="3025574"/>
+            <wp:extent cx="5989320" cy="3031681"/>
             <wp:docPr id="3" name="Picture 3"/>
             <wp:cNvGraphicFramePr>
               <a:graphicFrameLocks noChangeAspect="1"/>
@@ -836,7 +836,7 @@
                   <pic:spPr>
                     <a:xfrm>
                       <a:off x="0" y="0"/>
-                      <a:ext cx="5989320" cy="3025574"/>
+                      <a:ext cx="5989320" cy="3031681"/>
                     </a:xfrm>
                     <a:prstGeom prst="rect"/>
                   </pic:spPr>
@@ -876,7 +876,7 @@
       <w:r>
         <w:drawing>
           <wp:inline xmlns:a="http://schemas.openxmlformats.org/drawingml/2006/main" xmlns:pic="http://schemas.openxmlformats.org/drawingml/2006/picture">
-            <wp:extent cx="5989320" cy="3009007"/>
+            <wp:extent cx="5989320" cy="3025405"/>
             <wp:docPr id="4" name="Picture 4"/>
             <wp:cNvGraphicFramePr>
               <a:graphicFrameLocks noChangeAspect="1"/>
@@ -897,7 +897,7 @@
                   <pic:spPr>
                     <a:xfrm>
                       <a:off x="0" y="0"/>
-                      <a:ext cx="5989320" cy="3009007"/>
+                      <a:ext cx="5989320" cy="3025405"/>
                     </a:xfrm>
                     <a:prstGeom prst="rect"/>
                   </pic:spPr>
@@ -937,7 +937,7 @@
       <w:r>
         <w:drawing>
           <wp:inline xmlns:a="http://schemas.openxmlformats.org/drawingml/2006/main" xmlns:pic="http://schemas.openxmlformats.org/drawingml/2006/picture">
-            <wp:extent cx="5989320" cy="2994660"/>
+            <wp:extent cx="5989320" cy="3019340"/>
             <wp:docPr id="5" name="Picture 5"/>
             <wp:cNvGraphicFramePr>
               <a:graphicFrameLocks noChangeAspect="1"/>
@@ -958,7 +958,7 @@
                   <pic:spPr>
                     <a:xfrm>
                       <a:off x="0" y="0"/>
-                      <a:ext cx="5989320" cy="2994660"/>
+                      <a:ext cx="5989320" cy="3019340"/>
                     </a:xfrm>
                     <a:prstGeom prst="rect"/>
                   </pic:spPr>
@@ -998,7 +998,7 @@
       <w:r>
         <w:drawing>
           <wp:inline xmlns:a="http://schemas.openxmlformats.org/drawingml/2006/main" xmlns:pic="http://schemas.openxmlformats.org/drawingml/2006/picture">
-            <wp:extent cx="5989320" cy="2992605"/>
+            <wp:extent cx="5989320" cy="3023454"/>
             <wp:docPr id="6" name="Picture 6"/>
             <wp:cNvGraphicFramePr>
               <a:graphicFrameLocks noChangeAspect="1"/>
@@ -1019,7 +1019,7 @@
                   <pic:spPr>
                     <a:xfrm>
                       <a:off x="0" y="0"/>
-                      <a:ext cx="5989320" cy="2992605"/>
+                      <a:ext cx="5989320" cy="3023454"/>
                     </a:xfrm>
                     <a:prstGeom prst="rect"/>
                   </pic:spPr>
@@ -1059,7 +1059,7 @@
       <w:r>
         <w:drawing>
           <wp:inline xmlns:a="http://schemas.openxmlformats.org/drawingml/2006/main" xmlns:pic="http://schemas.openxmlformats.org/drawingml/2006/picture">
-            <wp:extent cx="5989320" cy="3023454"/>
+            <wp:extent cx="5989320" cy="3031681"/>
             <wp:docPr id="7" name="Picture 7"/>
             <wp:cNvGraphicFramePr>
               <a:graphicFrameLocks noChangeAspect="1"/>
@@ -1080,7 +1080,7 @@
                   <pic:spPr>
                     <a:xfrm>
                       <a:off x="0" y="0"/>
-                      <a:ext cx="5989320" cy="3023454"/>
+                      <a:ext cx="5989320" cy="3031681"/>
                     </a:xfrm>
                     <a:prstGeom prst="rect"/>
                   </pic:spPr>
@@ -1120,7 +1120,7 @@
       <w:r>
         <w:drawing>
           <wp:inline xmlns:a="http://schemas.openxmlformats.org/drawingml/2006/main" xmlns:pic="http://schemas.openxmlformats.org/drawingml/2006/picture">
-            <wp:extent cx="5989320" cy="3015199"/>
+            <wp:extent cx="5989320" cy="3031681"/>
             <wp:docPr id="8" name="Picture 8"/>
             <wp:cNvGraphicFramePr>
               <a:graphicFrameLocks noChangeAspect="1"/>
@@ -1141,7 +1141,7 @@
                   <pic:spPr>
                     <a:xfrm>
                       <a:off x="0" y="0"/>
-                      <a:ext cx="5989320" cy="3015199"/>
+                      <a:ext cx="5989320" cy="3031681"/>
                     </a:xfrm>
                     <a:prstGeom prst="rect"/>
                   </pic:spPr>
@@ -1181,7 +1181,7 @@
       <w:r>
         <w:drawing>
           <wp:inline xmlns:a="http://schemas.openxmlformats.org/drawingml/2006/main" xmlns:pic="http://schemas.openxmlformats.org/drawingml/2006/picture">
-            <wp:extent cx="5989320" cy="3606724"/>
+            <wp:extent cx="5989320" cy="3618939"/>
             <wp:docPr id="9" name="Picture 9"/>
             <wp:cNvGraphicFramePr>
               <a:graphicFrameLocks noChangeAspect="1"/>
@@ -1202,7 +1202,7 @@
                   <pic:spPr>
                     <a:xfrm>
                       <a:off x="0" y="0"/>
-                      <a:ext cx="5989320" cy="3606724"/>
+                      <a:ext cx="5989320" cy="3618939"/>
                     </a:xfrm>
                     <a:prstGeom prst="rect"/>
                   </pic:spPr>
@@ -1242,7 +1242,7 @@
       <w:r>
         <w:drawing>
           <wp:inline xmlns:a="http://schemas.openxmlformats.org/drawingml/2006/main" xmlns:pic="http://schemas.openxmlformats.org/drawingml/2006/picture">
-            <wp:extent cx="5989320" cy="3606724"/>
+            <wp:extent cx="5989320" cy="3618939"/>
             <wp:docPr id="10" name="Picture 10"/>
             <wp:cNvGraphicFramePr>
               <a:graphicFrameLocks noChangeAspect="1"/>
@@ -1263,7 +1263,7 @@
                   <pic:spPr>
                     <a:xfrm>
                       <a:off x="0" y="0"/>
-                      <a:ext cx="5989320" cy="3606724"/>
+                      <a:ext cx="5989320" cy="3618939"/>
                     </a:xfrm>
                     <a:prstGeom prst="rect"/>
                   </pic:spPr>
@@ -1303,7 +1303,7 @@
       <w:r>
         <w:drawing>
           <wp:inline xmlns:a="http://schemas.openxmlformats.org/drawingml/2006/main" xmlns:pic="http://schemas.openxmlformats.org/drawingml/2006/picture">
-            <wp:extent cx="5989320" cy="5405814"/>
+            <wp:extent cx="5989320" cy="5444836"/>
             <wp:docPr id="11" name="Picture 11"/>
             <wp:cNvGraphicFramePr>
               <a:graphicFrameLocks noChangeAspect="1"/>
@@ -1324,7 +1324,7 @@
                   <pic:spPr>
                     <a:xfrm>
                       <a:off x="0" y="0"/>
-                      <a:ext cx="5989320" cy="5405814"/>
+                      <a:ext cx="5989320" cy="5444836"/>
                     </a:xfrm>
                     <a:prstGeom prst="rect"/>
                   </pic:spPr>
@@ -1364,7 +1364,7 @@
       <w:r>
         <w:drawing>
           <wp:inline xmlns:a="http://schemas.openxmlformats.org/drawingml/2006/main" xmlns:pic="http://schemas.openxmlformats.org/drawingml/2006/picture">
-            <wp:extent cx="5989320" cy="3015227"/>
+            <wp:extent cx="5989320" cy="3023454"/>
             <wp:docPr id="12" name="Picture 12"/>
             <wp:cNvGraphicFramePr>
               <a:graphicFrameLocks noChangeAspect="1"/>
@@ -1385,7 +1385,7 @@
                   <pic:spPr>
                     <a:xfrm>
                       <a:off x="0" y="0"/>
-                      <a:ext cx="5989320" cy="3015227"/>
+                      <a:ext cx="5989320" cy="3023454"/>
                     </a:xfrm>
                     <a:prstGeom prst="rect"/>
                   </pic:spPr>
@@ -1425,7 +1425,7 @@
       <w:r>
         <w:drawing>
           <wp:inline xmlns:a="http://schemas.openxmlformats.org/drawingml/2006/main" xmlns:pic="http://schemas.openxmlformats.org/drawingml/2006/picture">
-            <wp:extent cx="5989320" cy="3017268"/>
+            <wp:extent cx="5989320" cy="3035795"/>
             <wp:docPr id="13" name="Picture 13"/>
             <wp:cNvGraphicFramePr>
               <a:graphicFrameLocks noChangeAspect="1"/>
@@ -1446,7 +1446,7 @@
                   <pic:spPr>
                     <a:xfrm>
                       <a:off x="0" y="0"/>
-                      <a:ext cx="5989320" cy="3017268"/>
+                      <a:ext cx="5989320" cy="3035795"/>
                     </a:xfrm>
                     <a:prstGeom prst="rect"/>
                   </pic:spPr>
@@ -2450,6 +2450,114 @@
           </w:p>
         </w:tc>
       </w:tr>
+      <w:tr>
+        <w:tc>
+          <w:tcPr>
+            <w:tcW w:type="dxa" w:w="5000"/>
+            <w:tcMar>
+              <w:top w:w="80" w:type="dxa"/>
+              <w:start w:w="120" w:type="dxa"/>
+              <w:bottom w:w="80" w:type="dxa"/>
+              <w:end w:w="120" w:type="dxa"/>
+            </w:tcMar>
+            <w:vAlign w:val="center"/>
+          </w:tcPr>
+          <w:p>
+            <w:r>
+              <w:t>portable_model_format</w:t>
+            </w:r>
+          </w:p>
+        </w:tc>
+        <w:tc>
+          <w:tcPr>
+            <w:tcW w:type="dxa" w:w="2500"/>
+            <w:tcMar>
+              <w:top w:w="80" w:type="dxa"/>
+              <w:start w:w="120" w:type="dxa"/>
+              <w:bottom w:w="80" w:type="dxa"/>
+              <w:end w:w="120" w:type="dxa"/>
+            </w:tcMar>
+            <w:vAlign w:val="center"/>
+          </w:tcPr>
+          <w:p>
+            <w:r>
+              <w:t>ดู observed summary</w:t>
+            </w:r>
+          </w:p>
+        </w:tc>
+        <w:tc>
+          <w:tcPr>
+            <w:tcW w:type="dxa" w:w="1860"/>
+            <w:shd w:fill="E8F5E9"/>
+            <w:tcMar>
+              <w:top w:w="80" w:type="dxa"/>
+              <w:start w:w="120" w:type="dxa"/>
+              <w:bottom w:w="80" w:type="dxa"/>
+              <w:end w:w="120" w:type="dxa"/>
+            </w:tcMar>
+            <w:vAlign w:val="center"/>
+          </w:tcPr>
+          <w:p>
+            <w:r>
+              <w:t>PASS</w:t>
+            </w:r>
+          </w:p>
+        </w:tc>
+      </w:tr>
+      <w:tr>
+        <w:tc>
+          <w:tcPr>
+            <w:tcW w:type="dxa" w:w="5000"/>
+            <w:tcMar>
+              <w:top w:w="80" w:type="dxa"/>
+              <w:start w:w="120" w:type="dxa"/>
+              <w:bottom w:w="80" w:type="dxa"/>
+              <w:end w:w="120" w:type="dxa"/>
+            </w:tcMar>
+            <w:vAlign w:val="center"/>
+          </w:tcPr>
+          <w:p>
+            <w:r>
+              <w:t>runtime_sklearn_not_required</w:t>
+            </w:r>
+          </w:p>
+        </w:tc>
+        <w:tc>
+          <w:tcPr>
+            <w:tcW w:type="dxa" w:w="2500"/>
+            <w:tcMar>
+              <w:top w:w="80" w:type="dxa"/>
+              <w:start w:w="120" w:type="dxa"/>
+              <w:bottom w:w="80" w:type="dxa"/>
+              <w:end w:w="120" w:type="dxa"/>
+            </w:tcMar>
+            <w:vAlign w:val="center"/>
+          </w:tcPr>
+          <w:p>
+            <w:r>
+              <w:t>ดู observed summary</w:t>
+            </w:r>
+          </w:p>
+        </w:tc>
+        <w:tc>
+          <w:tcPr>
+            <w:tcW w:type="dxa" w:w="1860"/>
+            <w:shd w:fill="E8F5E9"/>
+            <w:tcMar>
+              <w:top w:w="80" w:type="dxa"/>
+              <w:start w:w="120" w:type="dxa"/>
+              <w:bottom w:w="80" w:type="dxa"/>
+              <w:end w:w="120" w:type="dxa"/>
+            </w:tcMar>
+            <w:vAlign w:val="center"/>
+          </w:tcPr>
+          <w:p>
+            <w:r>
+              <w:t>PASS</w:t>
+            </w:r>
+          </w:p>
+        </w:tc>
+      </w:tr>
     </w:tbl>
     <w:p>
       <w:pPr>

</xml_diff>